<commit_message>
switched to Flask Python
</commit_message>
<xml_diff>
--- a/docxtemplates/Bootcamp_Nomination_Form.docx
+++ b/docxtemplates/Bootcamp_Nomination_Form.docx
@@ -51,7 +51,7 @@
                 <w:lang w:val="en-IN" w:eastAsia="en-IN" w:bidi="pa-IN"/>
               </w:rPr>
               <w:drawing>
-                <wp:inline distT="0" distB="0" distL="0" distR="0" wp14:anchorId="52A4D4F5" wp14:editId="6D99BBC1">
+                <wp:inline distT="0" distB="0" distL="0" distR="0" wp14:anchorId="52A4D4F5" wp14:editId="055F1B38">
                   <wp:extent cx="1003937" cy="484496"/>
                   <wp:effectExtent l="0" t="0" r="5715" b="0"/>
                   <wp:docPr id="195" name="Picture 9"/>
@@ -207,27 +207,7 @@
                 <w:sz w:val="20"/>
                 <w:szCs w:val="22"/>
               </w:rPr>
-              <w:t xml:space="preserve"> (</w:t>
-            </w:r>
-            <w:proofErr w:type="spellStart"/>
-            <w:r>
-              <w:rPr>
-                <w:rFonts w:ascii="Cambria" w:hAnsi="Cambria"/>
-                <w:color w:val="002060"/>
-                <w:sz w:val="20"/>
-                <w:szCs w:val="22"/>
-              </w:rPr>
-              <w:t>MeitY</w:t>
-            </w:r>
-            <w:proofErr w:type="spellEnd"/>
-            <w:r>
-              <w:rPr>
-                <w:rFonts w:ascii="Cambria" w:hAnsi="Cambria"/>
-                <w:color w:val="002060"/>
-                <w:sz w:val="20"/>
-                <w:szCs w:val="22"/>
-              </w:rPr>
-              <w:t>)</w:t>
+              <w:t xml:space="preserve"> (MeitY)</w:t>
             </w:r>
             <w:r>
               <w:rPr>
@@ -341,41 +321,13 @@
                 <w:sz w:val="20"/>
               </w:rPr>
             </w:pPr>
-            <w:proofErr w:type="spellStart"/>
             <w:r>
               <w:rPr>
                 <w:rFonts w:asciiTheme="majorHAnsi" w:hAnsiTheme="majorHAnsi"/>
                 <w:b/>
                 <w:sz w:val="24"/>
               </w:rPr>
-              <w:t>FutureSkills</w:t>
-            </w:r>
-            <w:proofErr w:type="spellEnd"/>
-            <w:r>
-              <w:rPr>
-                <w:rFonts w:asciiTheme="majorHAnsi" w:hAnsiTheme="majorHAnsi"/>
-                <w:b/>
-                <w:sz w:val="24"/>
-              </w:rPr>
-              <w:t xml:space="preserve"> PRIME (</w:t>
-            </w:r>
-            <w:proofErr w:type="spellStart"/>
-            <w:r>
-              <w:rPr>
-                <w:rFonts w:asciiTheme="majorHAnsi" w:hAnsiTheme="majorHAnsi"/>
-                <w:b/>
-                <w:sz w:val="24"/>
-              </w:rPr>
-              <w:t>Programme</w:t>
-            </w:r>
-            <w:proofErr w:type="spellEnd"/>
-            <w:r>
-              <w:rPr>
-                <w:rFonts w:asciiTheme="majorHAnsi" w:hAnsiTheme="majorHAnsi"/>
-                <w:b/>
-                <w:sz w:val="24"/>
-              </w:rPr>
-              <w:t xml:space="preserve"> for Re-skilling/Up-skilling of IT</w:t>
+              <w:t>FutureSkills PRIME (Programme for Re-skilling/Up-skilling of IT</w:t>
             </w:r>
             <w:r>
               <w:rPr>
@@ -1108,23 +1060,7 @@
                 <w:b/>
                 <w:bCs/>
               </w:rPr>
-              <w:t>{</w:t>
-            </w:r>
-            <w:proofErr w:type="spellStart"/>
-            <w:r>
-              <w:rPr>
-                <w:b/>
-                <w:bCs/>
-              </w:rPr>
-              <w:t>Resource_Centre_Name</w:t>
-            </w:r>
-            <w:proofErr w:type="spellEnd"/>
-            <w:r>
-              <w:rPr>
-                <w:b/>
-                <w:bCs/>
-              </w:rPr>
-              <w:t>}</w:t>
+              <w:t>{Resource_Centre_Name}</w:t>
             </w:r>
           </w:p>
         </w:tc>
@@ -1237,7 +1173,6 @@
                 <w:bCs/>
               </w:rPr>
             </w:pPr>
-            <w:proofErr w:type="gramStart"/>
             <w:r>
               <w:rPr>
                 <w:b/>
@@ -1246,11 +1181,7 @@
               <w:t>Role:</w:t>
             </w:r>
             <w:r>
-              <w:t xml:space="preserve"> {</w:t>
-            </w:r>
-            <w:proofErr w:type="gramEnd"/>
-            <w:r>
-              <w:t>Role}</w:t>
+              <w:t xml:space="preserve"> {Role}</w:t>
             </w:r>
           </w:p>
         </w:tc>
@@ -1330,15 +1261,7 @@
           </w:tcPr>
           <w:p>
             <w:r>
-              <w:t>{</w:t>
-            </w:r>
-            <w:proofErr w:type="spellStart"/>
-            <w:r>
-              <w:t>Course_Name</w:t>
-            </w:r>
-            <w:proofErr w:type="spellEnd"/>
-            <w:r>
-              <w:t>}</w:t>
+              <w:t>{Course_Name}</w:t>
             </w:r>
           </w:p>
         </w:tc>
@@ -1431,15 +1354,7 @@
           </w:tcPr>
           <w:p>
             <w:r>
-              <w:t>{</w:t>
-            </w:r>
-            <w:proofErr w:type="spellStart"/>
-            <w:r>
-              <w:t>Course_Start_Date</w:t>
-            </w:r>
-            <w:proofErr w:type="spellEnd"/>
-            <w:r>
-              <w:t>}</w:t>
+              <w:t>{Course_Start_Date}</w:t>
             </w:r>
           </w:p>
         </w:tc>
@@ -1571,15 +1486,7 @@
           </w:tcPr>
           <w:p>
             <w:r>
-              <w:t>{</w:t>
-            </w:r>
-            <w:proofErr w:type="spellStart"/>
-            <w:r>
-              <w:t>Applicant_Name</w:t>
-            </w:r>
-            <w:proofErr w:type="spellEnd"/>
-            <w:r>
-              <w:t>}</w:t>
+              <w:t>{Applicant_Name}</w:t>
             </w:r>
           </w:p>
         </w:tc>
@@ -1819,15 +1726,7 @@
           </w:tcPr>
           <w:p>
             <w:r>
-              <w:t>{</w:t>
-            </w:r>
-            <w:proofErr w:type="spellStart"/>
-            <w:r>
-              <w:t>Contact_Number</w:t>
-            </w:r>
-            <w:proofErr w:type="spellEnd"/>
-            <w:r>
-              <w:t>}</w:t>
+              <w:t>{Contact_Number}</w:t>
             </w:r>
           </w:p>
         </w:tc>
@@ -2043,15 +1942,7 @@
           </w:tcPr>
           <w:p>
             <w:r>
-              <w:t>{</w:t>
-            </w:r>
-            <w:proofErr w:type="spellStart"/>
-            <w:r>
-              <w:t>Native_State</w:t>
-            </w:r>
-            <w:proofErr w:type="spellEnd"/>
-            <w:r>
-              <w:t>}</w:t>
+              <w:t>{Native_State}</w:t>
             </w:r>
           </w:p>
         </w:tc>
@@ -2284,15 +2175,7 @@
           </w:tcPr>
           <w:p>
             <w:r>
-              <w:t>{</w:t>
-            </w:r>
-            <w:proofErr w:type="spellStart"/>
-            <w:r>
-              <w:t>Gov_ID_Number</w:t>
-            </w:r>
-            <w:proofErr w:type="spellEnd"/>
-            <w:r>
-              <w:t>}</w:t>
+              <w:t>{Gov_ID_Number}</w:t>
             </w:r>
           </w:p>
         </w:tc>
@@ -2408,15 +2291,7 @@
           </w:tcPr>
           <w:p>
             <w:r>
-              <w:t>{</w:t>
-            </w:r>
-            <w:proofErr w:type="spellStart"/>
-            <w:r>
-              <w:t>Organization_Academic_Institute</w:t>
-            </w:r>
-            <w:proofErr w:type="spellEnd"/>
-            <w:r>
-              <w:t>}</w:t>
+              <w:t>{Organization_Academic_Institute}</w:t>
             </w:r>
           </w:p>
         </w:tc>
@@ -2567,15 +2442,7 @@
           </w:tcPr>
           <w:p>
             <w:r>
-              <w:t>{</w:t>
-            </w:r>
-            <w:proofErr w:type="spellStart"/>
-            <w:r>
-              <w:t>Highest_Qualification</w:t>
-            </w:r>
-            <w:proofErr w:type="spellEnd"/>
-            <w:r>
-              <w:t>}</w:t>
+              <w:t>{Highest_Qualification}</w:t>
             </w:r>
           </w:p>
         </w:tc>
@@ -2815,15 +2682,7 @@
               </w:numPr>
             </w:pPr>
             <w:r>
-              <w:t>{</w:t>
-            </w:r>
-            <w:proofErr w:type="spellStart"/>
-            <w:r>
-              <w:t>Beneficiary_Category</w:t>
-            </w:r>
-            <w:proofErr w:type="spellEnd"/>
-            <w:r>
-              <w:t>}</w:t>
+              <w:t>{Beneficiary_Category}</w:t>
             </w:r>
           </w:p>
         </w:tc>
@@ -2947,15 +2806,7 @@
           </w:tcPr>
           <w:p>
             <w:r>
-              <w:t>{</w:t>
-            </w:r>
-            <w:proofErr w:type="spellStart"/>
-            <w:r>
-              <w:t>Previous_FSP_Program</w:t>
-            </w:r>
-            <w:proofErr w:type="spellEnd"/>
-            <w:r>
-              <w:t>}</w:t>
+              <w:t>{Previous_FSP_Program}</w:t>
             </w:r>
           </w:p>
         </w:tc>
@@ -3190,24 +3041,20 @@
             <w:gridSpan w:val="2"/>
           </w:tcPr>
           <w:p>
-            <w:proofErr w:type="gramStart"/>
             <w:r>
               <w:t>1. {</w:t>
             </w:r>
-            <w:proofErr w:type="gramEnd"/>
             <w:r>
               <w:t xml:space="preserve">Previous_FSP_Details_1} </w:t>
             </w:r>
           </w:p>
           <w:p>
-            <w:proofErr w:type="gramStart"/>
             <w:r>
               <w:t xml:space="preserve">2. </w:t>
             </w:r>
             <w:r>
               <w:t>{</w:t>
             </w:r>
-            <w:proofErr w:type="gramEnd"/>
             <w:r>
               <w:t>Previous_FSP_Details_2}</w:t>
             </w:r>
@@ -3215,15 +3062,6 @@
         </w:tc>
       </w:tr>
     </w:tbl>
-    <w:p>
-      <w:pPr>
-        <w:spacing w:before="155"/>
-        <w:ind w:left="140"/>
-        <w:rPr>
-          <w:sz w:val="20"/>
-        </w:rPr>
-      </w:pPr>
-    </w:p>
     <w:p>
       <w:pPr>
         <w:spacing w:before="155"/>
@@ -3665,15 +3503,6 @@
     </w:p>
     <w:p>
       <w:pPr>
-        <w:spacing w:before="121"/>
-        <w:ind w:left="140"/>
-        <w:rPr>
-          <w:sz w:val="20"/>
-        </w:rPr>
-      </w:pPr>
-    </w:p>
-    <w:p>
-      <w:pPr>
         <w:spacing w:before="91"/>
         <w:ind w:right="140"/>
         <w:jc w:val="right"/>
@@ -3704,20 +3533,16 @@
         <w:t xml:space="preserve"> </w:t>
       </w:r>
       <w:r>
-        <w:t>Co-</w:t>
-      </w:r>
-      <w:proofErr w:type="spellStart"/>
-      <w:r>
-        <w:t>ordinator</w:t>
-      </w:r>
-      <w:proofErr w:type="spellEnd"/>
+        <w:t>Co-ordinator</w:t>
+      </w:r>
     </w:p>
     <w:p>
       <w:pPr>
         <w:spacing w:before="11"/>
         <w:rPr>
-          <w:b/>
-          <w:sz w:val="12"/>
+          <w:rFonts w:ascii="Symbol" w:hAnsi="Symbol"/>
+          <w:i/>
+          <w:sz w:val="20"/>
         </w:rPr>
       </w:pPr>
       <w:r>
@@ -3800,26 +3625,6 @@
           </mc:Fallback>
         </mc:AlternateContent>
       </w:r>
-    </w:p>
-    <w:p>
-      <w:pPr>
-        <w:pStyle w:val="ListParagraph"/>
-        <w:numPr>
-          <w:ilvl w:val="0"/>
-          <w:numId w:val="1"/>
-        </w:numPr>
-        <w:tabs>
-          <w:tab w:val="left" w:pos="860"/>
-          <w:tab w:val="left" w:pos="861"/>
-        </w:tabs>
-        <w:spacing w:before="99" w:line="273" w:lineRule="auto"/>
-        <w:ind w:right="288"/>
-        <w:rPr>
-          <w:rFonts w:ascii="Symbol" w:hAnsi="Symbol"/>
-          <w:i/>
-          <w:sz w:val="20"/>
-        </w:rPr>
-      </w:pPr>
       <w:r>
         <w:rPr>
           <w:rFonts w:ascii="Cambria" w:hAnsi="Cambria"/>
@@ -5108,6 +4913,7 @@
   <w:style w:type="character" w:default="1" w:styleId="DefaultParagraphFont">
     <w:name w:val="Default Paragraph Font"/>
     <w:uiPriority w:val="1"/>
+    <w:semiHidden/>
     <w:unhideWhenUsed/>
   </w:style>
   <w:style w:type="table" w:default="1" w:styleId="TableNormal">

</xml_diff>

<commit_message>
Update form to remove online photo and signature upload, layout updates
</commit_message>
<xml_diff>
--- a/docxtemplates/Bootcamp_Nomination_Form.docx
+++ b/docxtemplates/Bootcamp_Nomination_Form.docx
@@ -51,7 +51,7 @@
                 <w:lang w:val="en-IN" w:eastAsia="en-IN" w:bidi="pa-IN"/>
               </w:rPr>
               <w:drawing>
-                <wp:inline distT="0" distB="0" distL="0" distR="0" wp14:anchorId="52A4D4F5" wp14:editId="66272E58">
+                <wp:inline distT="0" distB="0" distL="0" distR="0" wp14:anchorId="52A4D4F5" wp14:editId="047CC36D">
                   <wp:extent cx="1003937" cy="484496"/>
                   <wp:effectExtent l="0" t="0" r="5715" b="0"/>
                   <wp:docPr id="195" name="Picture 9"/>
@@ -3369,14 +3369,30 @@
           <w:lang w:val="en-IN"/>
         </w:rPr>
       </w:pPr>
-      <w:r>
+    </w:p>
+    <w:p>
+      <w:pPr>
+        <w:pStyle w:val="Heading1"/>
+        <w:ind w:left="720" w:right="140"/>
+        <w:jc w:val="right"/>
         <w:rPr>
           <w:b w:val="0"/>
           <w:bCs w:val="0"/>
           <w:lang w:val="en-IN"/>
         </w:rPr>
-        <w:t>{Signature}</w:t>
-      </w:r>
+      </w:pPr>
+    </w:p>
+    <w:p>
+      <w:pPr>
+        <w:pStyle w:val="Heading1"/>
+        <w:ind w:right="140"/>
+        <w:jc w:val="right"/>
+        <w:rPr>
+          <w:b w:val="0"/>
+          <w:bCs w:val="0"/>
+          <w:lang w:val="en-IN"/>
+        </w:rPr>
+      </w:pPr>
     </w:p>
     <w:p>
       <w:pPr>
@@ -3651,6 +3667,15 @@
         </w:rPr>
         <w:t>recommended.</w:t>
       </w:r>
+    </w:p>
+    <w:p>
+      <w:pPr>
+        <w:spacing w:before="121"/>
+        <w:ind w:left="140"/>
+        <w:rPr>
+          <w:sz w:val="20"/>
+        </w:rPr>
+      </w:pPr>
     </w:p>
     <w:p>
       <w:pPr>
@@ -5069,6 +5094,7 @@
   <w:style w:type="character" w:default="1" w:styleId="DefaultParagraphFont">
     <w:name w:val="Default Paragraph Font"/>
     <w:uiPriority w:val="1"/>
+    <w:semiHidden/>
     <w:unhideWhenUsed/>
   </w:style>
   <w:style w:type="table" w:default="1" w:styleId="TableNormal">

</xml_diff>

<commit_message>
Add HD logo and user modified template
</commit_message>
<xml_diff>
--- a/docxtemplates/Bootcamp_Nomination_Form.docx
+++ b/docxtemplates/Bootcamp_Nomination_Form.docx
@@ -51,7 +51,7 @@
                 <w:lang w:val="en-IN" w:eastAsia="en-IN" w:bidi="pa-IN"/>
               </w:rPr>
               <w:drawing>
-                <wp:inline distT="0" distB="0" distL="0" distR="0" wp14:anchorId="52A4D4F5" wp14:editId="047CC36D">
+                <wp:inline distT="0" distB="0" distL="0" distR="0" wp14:anchorId="52A4D4F5" wp14:editId="645FFE8C">
                   <wp:extent cx="1003937" cy="484496"/>
                   <wp:effectExtent l="0" t="0" r="5715" b="0"/>
                   <wp:docPr id="195" name="Picture 9"/>
@@ -3221,6 +3221,15 @@
           <w:sz w:val="20"/>
         </w:rPr>
       </w:pPr>
+    </w:p>
+    <w:p>
+      <w:pPr>
+        <w:spacing w:before="155"/>
+        <w:ind w:left="140"/>
+        <w:rPr>
+          <w:sz w:val="20"/>
+        </w:rPr>
+      </w:pPr>
       <w:r>
         <w:rPr>
           <w:sz w:val="20"/>
@@ -3429,7 +3438,7 @@
         <mc:AlternateContent>
           <mc:Choice Requires="wps">
             <w:drawing>
-              <wp:anchor distT="0" distB="0" distL="0" distR="0" simplePos="0" relativeHeight="251660288" behindDoc="1" locked="0" layoutInCell="1" allowOverlap="1" wp14:anchorId="216F785C" wp14:editId="4C692D2D">
+              <wp:anchor distT="0" distB="0" distL="0" distR="0" simplePos="0" relativeHeight="251660288" behindDoc="1" locked="0" layoutInCell="1" allowOverlap="1" wp14:anchorId="216F785C" wp14:editId="22C16D05">
                 <wp:simplePos x="0" y="0"/>
                 <wp:positionH relativeFrom="page">
                   <wp:posOffset>896620</wp:posOffset>
@@ -3494,7 +3503,7 @@
           </mc:Choice>
           <mc:Fallback>
             <w:pict>
-              <v:rect w14:anchorId="6F378250" id="Rectangle 3" o:spid="_x0000_s1026" style="position:absolute;margin-left:70.6pt;margin-top:12.5pt;width:454.25pt;height:.5pt;z-index:-251656192;visibility:visible;mso-wrap-style:square;mso-width-percent:0;mso-height-percent:0;mso-wrap-distance-left:0;mso-wrap-distance-top:0;mso-wrap-distance-right:0;mso-wrap-distance-bottom:0;mso-position-horizontal:absolute;mso-position-horizontal-relative:page;mso-position-vertical:absolute;mso-position-vertical-relative:text;mso-width-percent:0;mso-height-percent:0;mso-width-relative:page;mso-height-relative:page;v-text-anchor:top" o:gfxdata="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" fillcolor="black" stroked="f">
+              <v:rect w14:anchorId="7FFBF157" id="Rectangle 3" o:spid="_x0000_s1026" style="position:absolute;margin-left:70.6pt;margin-top:12.5pt;width:454.25pt;height:.5pt;z-index:-251656192;visibility:visible;mso-wrap-style:square;mso-width-percent:0;mso-height-percent:0;mso-wrap-distance-left:0;mso-wrap-distance-top:0;mso-wrap-distance-right:0;mso-wrap-distance-bottom:0;mso-position-horizontal:absolute;mso-position-horizontal-relative:page;mso-position-vertical:absolute;mso-position-vertical-relative:text;mso-width-percent:0;mso-height-percent:0;mso-width-relative:page;mso-height-relative:page;v-text-anchor:top" o:gfxdata="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" fillcolor="black" stroked="f">
                 <w10:wrap type="topAndBottom" anchorx="page"/>
               </v:rect>
             </w:pict>
@@ -3719,11 +3728,18 @@
     </w:p>
     <w:p>
       <w:pPr>
-        <w:spacing w:before="11"/>
-        <w:rPr>
-          <w:rFonts w:ascii="Symbol" w:hAnsi="Symbol"/>
+        <w:pStyle w:val="Heading1"/>
+        <w:numPr>
+          <w:ilvl w:val="0"/>
+          <w:numId w:val="6"/>
+        </w:numPr>
+        <w:ind w:right="137"/>
+        <w:jc w:val="left"/>
+        <w:rPr>
+          <w:b w:val="0"/>
+          <w:bCs w:val="0"/>
           <w:i/>
-          <w:sz w:val="20"/>
+          <w:sz w:val="18"/>
         </w:rPr>
       </w:pPr>
       <w:r>
@@ -3734,13 +3750,13 @@
         <mc:AlternateContent>
           <mc:Choice Requires="wps">
             <w:drawing>
-              <wp:anchor distT="0" distB="0" distL="0" distR="0" simplePos="0" relativeHeight="251661312" behindDoc="1" locked="0" layoutInCell="1" allowOverlap="1" wp14:anchorId="79F6E352" wp14:editId="0F7BC80A">
+              <wp:anchor distT="0" distB="0" distL="0" distR="0" simplePos="0" relativeHeight="251662336" behindDoc="1" locked="0" layoutInCell="1" allowOverlap="1" wp14:anchorId="76743C4C" wp14:editId="009AD817">
                 <wp:simplePos x="0" y="0"/>
                 <wp:positionH relativeFrom="page">
-                  <wp:posOffset>914400</wp:posOffset>
+                  <wp:posOffset>851535</wp:posOffset>
                 </wp:positionH>
                 <wp:positionV relativeFrom="paragraph">
-                  <wp:posOffset>141605</wp:posOffset>
+                  <wp:posOffset>41275</wp:posOffset>
                 </wp:positionV>
                 <wp:extent cx="1828800" cy="7620"/>
                 <wp:effectExtent l="0" t="0" r="0" b="0"/>
@@ -3799,7 +3815,7 @@
           </mc:Choice>
           <mc:Fallback>
             <w:pict>
-              <v:rect w14:anchorId="798DEBD3" id="Rectangle 2" o:spid="_x0000_s1026" style="position:absolute;margin-left:1in;margin-top:11.15pt;width:2in;height:.6pt;z-index:-251655168;visibility:visible;mso-wrap-style:square;mso-width-percent:0;mso-height-percent:0;mso-wrap-distance-left:0;mso-wrap-distance-top:0;mso-wrap-distance-right:0;mso-wrap-distance-bottom:0;mso-position-horizontal:absolute;mso-position-horizontal-relative:page;mso-position-vertical:absolute;mso-position-vertical-relative:text;mso-width-percent:0;mso-height-percent:0;mso-width-relative:page;mso-height-relative:page;v-text-anchor:top" o:gfxdata="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" fillcolor="black" stroked="f">
+              <v:rect w14:anchorId="27F887F0" id="Rectangle 2" o:spid="_x0000_s1026" style="position:absolute;margin-left:67.05pt;margin-top:3.25pt;width:2in;height:.6pt;z-index:-251654144;visibility:visible;mso-wrap-style:square;mso-width-percent:0;mso-height-percent:0;mso-wrap-distance-left:0;mso-wrap-distance-top:0;mso-wrap-distance-right:0;mso-wrap-distance-bottom:0;mso-position-horizontal:absolute;mso-position-horizontal-relative:page;mso-position-vertical:absolute;mso-position-vertical-relative:text;mso-width-percent:0;mso-height-percent:0;mso-width-relative:page;mso-height-relative:page;v-text-anchor:top" o:gfxdata="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" fillcolor="black" stroked="f">
                 <w10:wrap type="topAndBottom" anchorx="page"/>
               </v:rect>
             </w:pict>
@@ -3809,6 +3825,8 @@
       <w:r>
         <w:rPr>
           <w:rFonts w:ascii="Cambria" w:hAnsi="Cambria"/>
+          <w:b w:val="0"/>
+          <w:bCs w:val="0"/>
           <w:position w:val="5"/>
           <w:sz w:val="13"/>
         </w:rPr>
@@ -3816,6 +3834,8 @@
       </w:r>
       <w:r>
         <w:rPr>
+          <w:b w:val="0"/>
+          <w:bCs w:val="0"/>
           <w:i/>
           <w:sz w:val="18"/>
         </w:rPr>
@@ -3824,25 +3844,23 @@
     </w:p>
     <w:p>
       <w:pPr>
-        <w:pStyle w:val="ListParagraph"/>
+        <w:pStyle w:val="Heading1"/>
         <w:numPr>
           <w:ilvl w:val="0"/>
-          <w:numId w:val="1"/>
+          <w:numId w:val="6"/>
         </w:numPr>
-        <w:tabs>
-          <w:tab w:val="left" w:pos="860"/>
-          <w:tab w:val="left" w:pos="861"/>
-        </w:tabs>
-        <w:ind w:hanging="361"/>
-        <w:rPr>
-          <w:rFonts w:ascii="Symbol" w:hAnsi="Symbol"/>
-          <w:i/>
-          <w:sz w:val="18"/>
+        <w:ind w:right="137"/>
+        <w:jc w:val="left"/>
+        <w:rPr>
+          <w:b w:val="0"/>
+          <w:bCs w:val="0"/>
         </w:rPr>
       </w:pPr>
       <w:r>
         <w:rPr>
           <w:rFonts w:ascii="Cambria" w:hAnsi="Cambria"/>
+          <w:b w:val="0"/>
+          <w:bCs w:val="0"/>
           <w:position w:val="5"/>
           <w:sz w:val="13"/>
         </w:rPr>
@@ -3851,6 +3869,8 @@
       <w:r>
         <w:rPr>
           <w:rFonts w:ascii="Cambria" w:hAnsi="Cambria"/>
+          <w:b w:val="0"/>
+          <w:bCs w:val="0"/>
           <w:spacing w:val="24"/>
           <w:position w:val="5"/>
           <w:sz w:val="13"/>
@@ -3859,6 +3879,8 @@
       </w:r>
       <w:r>
         <w:rPr>
+          <w:b w:val="0"/>
+          <w:bCs w:val="0"/>
           <w:i/>
           <w:sz w:val="18"/>
         </w:rPr>
@@ -3866,6 +3888,8 @@
       </w:r>
       <w:r>
         <w:rPr>
+          <w:b w:val="0"/>
+          <w:bCs w:val="0"/>
           <w:i/>
           <w:spacing w:val="-4"/>
           <w:sz w:val="18"/>
@@ -3874,6 +3898,8 @@
       </w:r>
       <w:r>
         <w:rPr>
+          <w:b w:val="0"/>
+          <w:bCs w:val="0"/>
           <w:i/>
           <w:sz w:val="18"/>
         </w:rPr>
@@ -3881,6 +3907,8 @@
       </w:r>
       <w:r>
         <w:rPr>
+          <w:b w:val="0"/>
+          <w:bCs w:val="0"/>
           <w:i/>
           <w:spacing w:val="-2"/>
           <w:sz w:val="18"/>
@@ -3889,6 +3917,8 @@
       </w:r>
       <w:r>
         <w:rPr>
+          <w:b w:val="0"/>
+          <w:bCs w:val="0"/>
           <w:i/>
           <w:sz w:val="18"/>
         </w:rPr>
@@ -3896,6 +3926,8 @@
       </w:r>
       <w:r>
         <w:rPr>
+          <w:b w:val="0"/>
+          <w:bCs w:val="0"/>
           <w:i/>
           <w:spacing w:val="-1"/>
           <w:sz w:val="18"/>
@@ -3904,6 +3936,8 @@
       </w:r>
       <w:r>
         <w:rPr>
+          <w:b w:val="0"/>
+          <w:bCs w:val="0"/>
           <w:i/>
           <w:sz w:val="18"/>
         </w:rPr>
@@ -3911,6 +3945,8 @@
       </w:r>
       <w:r>
         <w:rPr>
+          <w:b w:val="0"/>
+          <w:bCs w:val="0"/>
           <w:i/>
           <w:spacing w:val="-2"/>
           <w:sz w:val="18"/>
@@ -3919,6 +3955,8 @@
       </w:r>
       <w:r>
         <w:rPr>
+          <w:b w:val="0"/>
+          <w:bCs w:val="0"/>
           <w:i/>
           <w:sz w:val="18"/>
         </w:rPr>
@@ -3926,6 +3964,8 @@
       </w:r>
       <w:r>
         <w:rPr>
+          <w:b w:val="0"/>
+          <w:bCs w:val="0"/>
           <w:i/>
           <w:spacing w:val="-1"/>
           <w:sz w:val="18"/>
@@ -3934,6 +3974,8 @@
       </w:r>
       <w:r>
         <w:rPr>
+          <w:b w:val="0"/>
+          <w:bCs w:val="0"/>
           <w:i/>
           <w:sz w:val="18"/>
         </w:rPr>
@@ -3941,6 +3983,8 @@
       </w:r>
       <w:r>
         <w:rPr>
+          <w:b w:val="0"/>
+          <w:bCs w:val="0"/>
           <w:i/>
           <w:spacing w:val="-2"/>
           <w:sz w:val="18"/>
@@ -3949,6 +3993,8 @@
       </w:r>
       <w:r>
         <w:rPr>
+          <w:b w:val="0"/>
+          <w:bCs w:val="0"/>
           <w:i/>
           <w:sz w:val="18"/>
         </w:rPr>
@@ -3956,6 +4002,8 @@
       </w:r>
       <w:r>
         <w:rPr>
+          <w:b w:val="0"/>
+          <w:bCs w:val="0"/>
           <w:i/>
           <w:spacing w:val="-3"/>
           <w:sz w:val="18"/>
@@ -3964,6 +4012,8 @@
       </w:r>
       <w:r>
         <w:rPr>
+          <w:b w:val="0"/>
+          <w:bCs w:val="0"/>
           <w:i/>
           <w:sz w:val="18"/>
         </w:rPr>
@@ -3971,6 +4021,8 @@
       </w:r>
       <w:r>
         <w:rPr>
+          <w:b w:val="0"/>
+          <w:bCs w:val="0"/>
           <w:i/>
           <w:spacing w:val="-4"/>
           <w:sz w:val="18"/>
@@ -3979,6 +4031,8 @@
       </w:r>
       <w:r>
         <w:rPr>
+          <w:b w:val="0"/>
+          <w:bCs w:val="0"/>
           <w:i/>
           <w:sz w:val="18"/>
         </w:rPr>
@@ -3986,6 +4040,8 @@
       </w:r>
       <w:r>
         <w:rPr>
+          <w:b w:val="0"/>
+          <w:bCs w:val="0"/>
           <w:i/>
           <w:spacing w:val="-2"/>
           <w:sz w:val="18"/>
@@ -3994,6 +4050,8 @@
       </w:r>
       <w:r>
         <w:rPr>
+          <w:b w:val="0"/>
+          <w:bCs w:val="0"/>
           <w:i/>
           <w:sz w:val="18"/>
         </w:rPr>
@@ -4001,6 +4059,8 @@
       </w:r>
       <w:r>
         <w:rPr>
+          <w:b w:val="0"/>
+          <w:bCs w:val="0"/>
           <w:i/>
           <w:spacing w:val="-2"/>
           <w:sz w:val="18"/>
@@ -4009,6 +4069,8 @@
       </w:r>
       <w:r>
         <w:rPr>
+          <w:b w:val="0"/>
+          <w:bCs w:val="0"/>
           <w:i/>
           <w:sz w:val="18"/>
         </w:rPr>
@@ -4016,6 +4078,8 @@
       </w:r>
       <w:r>
         <w:rPr>
+          <w:b w:val="0"/>
+          <w:bCs w:val="0"/>
           <w:i/>
           <w:spacing w:val="-1"/>
           <w:sz w:val="18"/>
@@ -4024,11 +4088,20 @@
       </w:r>
       <w:r>
         <w:rPr>
+          <w:b w:val="0"/>
+          <w:bCs w:val="0"/>
           <w:i/>
           <w:sz w:val="18"/>
         </w:rPr>
         <w:t>once</w:t>
       </w:r>
+    </w:p>
+    <w:p>
+      <w:pPr>
+        <w:pStyle w:val="Heading1"/>
+        <w:ind w:right="137"/>
+        <w:jc w:val="right"/>
+      </w:pPr>
     </w:p>
     <w:sectPr>
       <w:type w:val="continuous"/>
@@ -4537,6 +4610,119 @@
     </w:lvl>
   </w:abstractNum>
   <w:abstractNum w:abstractNumId="4" w15:restartNumberingAfterBreak="0">
+    <w:nsid w:val="7B082A8F"/>
+    <w:multiLevelType w:val="hybridMultilevel"/>
+    <w:tmpl w:val="C9F6729A"/>
+    <w:lvl w:ilvl="0" w:tplc="40090001">
+      <w:start w:val="1"/>
+      <w:numFmt w:val="bullet"/>
+      <w:lvlText w:val=""/>
+      <w:lvlJc w:val="left"/>
+      <w:pPr>
+        <w:ind w:left="720" w:hanging="360"/>
+      </w:pPr>
+      <w:rPr>
+        <w:rFonts w:ascii="Symbol" w:hAnsi="Symbol" w:hint="default"/>
+      </w:rPr>
+    </w:lvl>
+    <w:lvl w:ilvl="1" w:tplc="40090003" w:tentative="1">
+      <w:start w:val="1"/>
+      <w:numFmt w:val="bullet"/>
+      <w:lvlText w:val="o"/>
+      <w:lvlJc w:val="left"/>
+      <w:pPr>
+        <w:ind w:left="1440" w:hanging="360"/>
+      </w:pPr>
+      <w:rPr>
+        <w:rFonts w:ascii="Courier New" w:hAnsi="Courier New" w:cs="Courier New" w:hint="default"/>
+      </w:rPr>
+    </w:lvl>
+    <w:lvl w:ilvl="2" w:tplc="40090005" w:tentative="1">
+      <w:start w:val="1"/>
+      <w:numFmt w:val="bullet"/>
+      <w:lvlText w:val=""/>
+      <w:lvlJc w:val="left"/>
+      <w:pPr>
+        <w:ind w:left="2160" w:hanging="360"/>
+      </w:pPr>
+      <w:rPr>
+        <w:rFonts w:ascii="Wingdings" w:hAnsi="Wingdings" w:hint="default"/>
+      </w:rPr>
+    </w:lvl>
+    <w:lvl w:ilvl="3" w:tplc="40090001" w:tentative="1">
+      <w:start w:val="1"/>
+      <w:numFmt w:val="bullet"/>
+      <w:lvlText w:val=""/>
+      <w:lvlJc w:val="left"/>
+      <w:pPr>
+        <w:ind w:left="2880" w:hanging="360"/>
+      </w:pPr>
+      <w:rPr>
+        <w:rFonts w:ascii="Symbol" w:hAnsi="Symbol" w:hint="default"/>
+      </w:rPr>
+    </w:lvl>
+    <w:lvl w:ilvl="4" w:tplc="40090003" w:tentative="1">
+      <w:start w:val="1"/>
+      <w:numFmt w:val="bullet"/>
+      <w:lvlText w:val="o"/>
+      <w:lvlJc w:val="left"/>
+      <w:pPr>
+        <w:ind w:left="3600" w:hanging="360"/>
+      </w:pPr>
+      <w:rPr>
+        <w:rFonts w:ascii="Courier New" w:hAnsi="Courier New" w:cs="Courier New" w:hint="default"/>
+      </w:rPr>
+    </w:lvl>
+    <w:lvl w:ilvl="5" w:tplc="40090005" w:tentative="1">
+      <w:start w:val="1"/>
+      <w:numFmt w:val="bullet"/>
+      <w:lvlText w:val=""/>
+      <w:lvlJc w:val="left"/>
+      <w:pPr>
+        <w:ind w:left="4320" w:hanging="360"/>
+      </w:pPr>
+      <w:rPr>
+        <w:rFonts w:ascii="Wingdings" w:hAnsi="Wingdings" w:hint="default"/>
+      </w:rPr>
+    </w:lvl>
+    <w:lvl w:ilvl="6" w:tplc="40090001" w:tentative="1">
+      <w:start w:val="1"/>
+      <w:numFmt w:val="bullet"/>
+      <w:lvlText w:val=""/>
+      <w:lvlJc w:val="left"/>
+      <w:pPr>
+        <w:ind w:left="5040" w:hanging="360"/>
+      </w:pPr>
+      <w:rPr>
+        <w:rFonts w:ascii="Symbol" w:hAnsi="Symbol" w:hint="default"/>
+      </w:rPr>
+    </w:lvl>
+    <w:lvl w:ilvl="7" w:tplc="40090003" w:tentative="1">
+      <w:start w:val="1"/>
+      <w:numFmt w:val="bullet"/>
+      <w:lvlText w:val="o"/>
+      <w:lvlJc w:val="left"/>
+      <w:pPr>
+        <w:ind w:left="5760" w:hanging="360"/>
+      </w:pPr>
+      <w:rPr>
+        <w:rFonts w:ascii="Courier New" w:hAnsi="Courier New" w:cs="Courier New" w:hint="default"/>
+      </w:rPr>
+    </w:lvl>
+    <w:lvl w:ilvl="8" w:tplc="40090005" w:tentative="1">
+      <w:start w:val="1"/>
+      <w:numFmt w:val="bullet"/>
+      <w:lvlText w:val=""/>
+      <w:lvlJc w:val="left"/>
+      <w:pPr>
+        <w:ind w:left="6480" w:hanging="360"/>
+      </w:pPr>
+      <w:rPr>
+        <w:rFonts w:ascii="Wingdings" w:hAnsi="Wingdings" w:hint="default"/>
+      </w:rPr>
+    </w:lvl>
+  </w:abstractNum>
+  <w:abstractNum w:abstractNumId="5" w15:restartNumberingAfterBreak="0">
     <w:nsid w:val="7DEC0DE6"/>
     <w:multiLevelType w:val="hybridMultilevel"/>
     <w:tmpl w:val="ACA0FFF6"/>
@@ -4659,13 +4845,16 @@
     <w:abstractNumId w:val="3"/>
   </w:num>
   <w:num w:numId="3" w16cid:durableId="210970345">
-    <w:abstractNumId w:val="4"/>
+    <w:abstractNumId w:val="5"/>
   </w:num>
   <w:num w:numId="4" w16cid:durableId="1496145946">
     <w:abstractNumId w:val="0"/>
   </w:num>
   <w:num w:numId="5" w16cid:durableId="1299453323">
     <w:abstractNumId w:val="2"/>
+  </w:num>
+  <w:num w:numId="6" w16cid:durableId="1580093304">
+    <w:abstractNumId w:val="4"/>
   </w:num>
 </w:numbering>
 </file>

</xml_diff>

<commit_message>
Reduce margins and trim trailing paragraphs in docx templates to fix pagination
</commit_message>
<xml_diff>
--- a/docxtemplates/Bootcamp_Nomination_Form.docx
+++ b/docxtemplates/Bootcamp_Nomination_Form.docx
@@ -4096,17 +4096,10 @@
         <w:t>once</w:t>
       </w:r>
     </w:p>
-    <w:p>
-      <w:pPr>
-        <w:pStyle w:val="Heading1"/>
-        <w:ind w:right="137"/>
-        <w:jc w:val="right"/>
-      </w:pPr>
-    </w:p>
     <w:sectPr>
       <w:type w:val="continuous"/>
       <w:pgSz w:w="11910" w:h="16840"/>
-      <w:pgMar w:top="680" w:right="1300" w:bottom="280" w:left="1300" w:header="720" w:footer="720" w:gutter="0"/>
+      <w:pgMar w:top="454" w:right="680" w:bottom="454" w:left="680" w:header="720" w:footer="720" w:gutter="0"/>
       <w:cols w:space="720"/>
     </w:sectPr>
   </w:body>

</xml_diff>

<commit_message>
Remove NIELIT logo from PDF generator per user request
</commit_message>
<xml_diff>
--- a/docxtemplates/Bootcamp_Nomination_Form.docx
+++ b/docxtemplates/Bootcamp_Nomination_Form.docx
@@ -2,11 +2,19 @@
 <file path=word/document.xml><?xml version="1.0" encoding="utf-8"?>
 <w:document xmlns:wpc="http://schemas.microsoft.com/office/word/2010/wordprocessingCanvas" xmlns:cx="http://schemas.microsoft.com/office/drawing/2014/chartex" xmlns:cx1="http://schemas.microsoft.com/office/drawing/2015/9/8/chartex" xmlns:cx2="http://schemas.microsoft.com/office/drawing/2015/10/21/chartex" xmlns:cx3="http://schemas.microsoft.com/office/drawing/2016/5/9/chartex" xmlns:cx4="http://schemas.microsoft.com/office/drawing/2016/5/10/chartex" xmlns:cx5="http://schemas.microsoft.com/office/drawing/2016/5/11/chartex" xmlns:cx6="http://schemas.microsoft.com/office/drawing/2016/5/12/chartex" xmlns:cx7="http://schemas.microsoft.com/office/drawing/2016/5/13/chartex" xmlns:cx8="http://schemas.microsoft.com/office/drawing/2016/5/14/chartex" xmlns:mc="http://schemas.openxmlformats.org/markup-compatibility/2006" xmlns:aink="http://schemas.microsoft.com/office/drawing/2016/ink" xmlns:am3d="http://schemas.microsoft.com/office/drawing/2017/model3d" xmlns:o="urn:schemas-microsoft-com:office:office" xmlns:oel="http://schemas.microsoft.com/office/2019/extlst" xmlns:r="http://schemas.openxmlformats.org/officeDocument/2006/relationships" xmlns:m="http://schemas.openxmlformats.org/officeDocument/2006/math" xmlns:v="urn:schemas-microsoft-com:vml" xmlns:wp14="http://schemas.microsoft.com/office/word/2010/wordprocessingDrawing" xmlns:wp="http://schemas.openxmlformats.org/drawingml/2006/wordprocessingDrawing" xmlns:w10="urn:schemas-microsoft-com:office:word" xmlns:w="http://schemas.openxmlformats.org/wordprocessingml/2006/main" xmlns:w14="http://schemas.microsoft.com/office/word/2010/wordml" xmlns:w15="http://schemas.microsoft.com/office/word/2012/wordml" xmlns:w16cex="http://schemas.microsoft.com/office/word/2018/wordml/cex" xmlns:w16cid="http://schemas.microsoft.com/office/word/2016/wordml/cid" xmlns:w16="http://schemas.microsoft.com/office/word/2018/wordml" xmlns:w16du="http://schemas.microsoft.com/office/word/2023/wordml/word16du" xmlns:w16sdtdh="http://schemas.microsoft.com/office/word/2020/wordml/sdtdatahash" xmlns:w16sdtfl="http://schemas.microsoft.com/office/word/2024/wordml/sdtformatlock" xmlns:w16se="http://schemas.microsoft.com/office/word/2015/wordml/symex" xmlns:wpg="http://schemas.microsoft.com/office/word/2010/wordprocessingGroup" xmlns:wpi="http://schemas.microsoft.com/office/word/2010/wordprocessingInk" xmlns:wne="http://schemas.microsoft.com/office/word/2006/wordml" xmlns:wps="http://schemas.microsoft.com/office/word/2010/wordprocessingShape" mc:Ignorable="w14 w15 w16se w16cid w16 w16cex w16sdtdh w16sdtfl w16du wp14">
   <w:body>
+    <w:p>
+      <w:pPr>
+        <w:spacing w:before="8"/>
+        <w:rPr>
+          <w:sz w:val="15"/>
+        </w:rPr>
+      </w:pPr>
+    </w:p>
     <w:tbl>
       <w:tblPr>
         <w:tblStyle w:val="TableGrid"/>
-        <w:tblpPr w:leftFromText="180" w:rightFromText="180" w:vertAnchor="text" w:horzAnchor="margin" w:tblpY="583"/>
         <w:tblW w:w="10622" w:type="dxa"/>
+        <w:tblInd w:w="-702" w:type="dxa"/>
         <w:tblBorders>
           <w:top w:val="none" w:sz="0" w:space="0" w:color="auto"/>
           <w:left w:val="none" w:sz="0" w:space="0" w:color="auto"/>
@@ -18,9 +26,9 @@
         <w:tblLook w:val="04A0" w:firstRow="1" w:lastRow="0" w:firstColumn="1" w:lastColumn="0" w:noHBand="0" w:noVBand="1"/>
       </w:tblPr>
       <w:tblGrid>
-        <w:gridCol w:w="1710"/>
-        <w:gridCol w:w="7194"/>
-        <w:gridCol w:w="1718"/>
+        <w:gridCol w:w="1812"/>
+        <w:gridCol w:w="7094"/>
+        <w:gridCol w:w="1716"/>
       </w:tblGrid>
       <w:tr>
         <w:trPr>
@@ -28,7 +36,7 @@
         </w:trPr>
         <w:tc>
           <w:tcPr>
-            <w:tcW w:w="1710" w:type="dxa"/>
+            <w:tcW w:w="1812" w:type="dxa"/>
             <w:shd w:val="clear" w:color="auto" w:fill="FFFFFF" w:themeFill="background1"/>
           </w:tcPr>
           <w:p>
@@ -36,12 +44,6 @@
               <w:pStyle w:val="Header"/>
               <w:ind w:left="-109"/>
             </w:pPr>
-          </w:p>
-          <w:p>
-            <w:pPr>
-              <w:pStyle w:val="Header"/>
-              <w:jc w:val="center"/>
-            </w:pPr>
             <w:r>
               <w:rPr>
                 <w:noProof/>
@@ -49,9 +51,9 @@
                 <w:lang w:val="en-IN" w:eastAsia="en-IN" w:bidi="pa-IN"/>
               </w:rPr>
               <w:drawing>
-                <wp:inline distT="0" distB="0" distL="0" distR="0" wp14:anchorId="4C0EB40C" wp14:editId="1988C1BB">
-                  <wp:extent cx="894744" cy="431800"/>
-                  <wp:effectExtent l="0" t="0" r="635" b="6350"/>
+                <wp:inline distT="0" distB="0" distL="0" distR="0" wp14:anchorId="52A4D4F5" wp14:editId="645FFE8C">
+                  <wp:extent cx="1003937" cy="484496"/>
+                  <wp:effectExtent l="0" t="0" r="5715" b="0"/>
                   <wp:docPr id="195" name="Picture 9"/>
                   <wp:cNvGraphicFramePr>
                     <a:graphicFrameLocks xmlns:a="http://schemas.openxmlformats.org/drawingml/2006/main" noChangeAspect="1"/>
@@ -77,7 +79,7 @@
                         <pic:spPr bwMode="auto">
                           <a:xfrm>
                             <a:off x="0" y="0"/>
-                            <a:ext cx="928682" cy="448178"/>
+                            <a:ext cx="1037680" cy="500780"/>
                           </a:xfrm>
                           <a:prstGeom prst="rect">
                             <a:avLst/>
@@ -98,10 +100,22 @@
               </w:drawing>
             </w:r>
           </w:p>
-        </w:tc>
-        <w:tc>
-          <w:tcPr>
-            <w:tcW w:w="7194" w:type="dxa"/>
+          <w:p>
+            <w:pPr>
+              <w:pStyle w:val="Header"/>
+            </w:pPr>
+            <w:r>
+              <w:rPr>
+                <w:b/>
+                <w:bCs/>
+              </w:rPr>
+              <w:t xml:space="preserve">  </w:t>
+            </w:r>
+          </w:p>
+        </w:tc>
+        <w:tc>
+          <w:tcPr>
+            <w:tcW w:w="7094" w:type="dxa"/>
             <w:shd w:val="clear" w:color="auto" w:fill="FFFFFF" w:themeFill="background1"/>
           </w:tcPr>
           <w:p>
@@ -238,30 +252,19 @@
         </w:tc>
         <w:tc>
           <w:tcPr>
-            <w:tcW w:w="1718" w:type="dxa"/>
+            <w:tcW w:w="1716" w:type="dxa"/>
             <w:shd w:val="clear" w:color="auto" w:fill="FFFFFF" w:themeFill="background1"/>
           </w:tcPr>
           <w:p>
             <w:pPr>
               <w:pStyle w:val="Header"/>
-              <w:jc w:val="center"/>
+              <w:jc w:val="right"/>
               <w:rPr>
                 <w:color w:val="002060"/>
                 <w:sz w:val="26"/>
                 <w:szCs w:val="26"/>
               </w:rPr>
             </w:pPr>
-          </w:p>
-          <w:p>
-            <w:pPr>
-              <w:pStyle w:val="Header"/>
-              <w:jc w:val="center"/>
-              <w:rPr>
-                <w:color w:val="002060"/>
-                <w:sz w:val="26"/>
-                <w:szCs w:val="26"/>
-              </w:rPr>
-            </w:pPr>
             <w:r>
               <w:rPr>
                 <w:noProof/>
@@ -269,7 +272,7 @@
                 <w:lang w:val="en-IN" w:eastAsia="en-IN" w:bidi="pa-IN"/>
               </w:rPr>
               <w:drawing>
-                <wp:inline distT="0" distB="0" distL="0" distR="0" wp14:anchorId="119EF93C" wp14:editId="1ACC2F91">
+                <wp:inline distT="0" distB="0" distL="0" distR="0" wp14:anchorId="16775FE9" wp14:editId="7CA73E6A">
                   <wp:extent cx="951859" cy="450377"/>
                   <wp:effectExtent l="0" t="0" r="1270" b="6985"/>
                   <wp:docPr id="1" name="image1.png"/>
@@ -429,14 +432,6 @@
         </w:tc>
       </w:tr>
     </w:tbl>
-    <w:p>
-      <w:pPr>
-        <w:spacing w:before="8"/>
-        <w:rPr>
-          <w:sz w:val="15"/>
-        </w:rPr>
-      </w:pPr>
-    </w:p>
     <w:p>
       <w:pPr>
         <w:spacing w:before="8"/>
@@ -971,7 +966,8 @@
     </w:p>
     <w:tbl>
       <w:tblPr>
-        <w:tblW w:w="9867" w:type="dxa"/>
+        <w:tblW w:w="10260" w:type="dxa"/>
+        <w:tblInd w:w="-483" w:type="dxa"/>
         <w:tblBorders>
           <w:top w:val="single" w:sz="4" w:space="0" w:color="000000"/>
           <w:left w:val="single" w:sz="4" w:space="0" w:color="000000"/>
@@ -988,8 +984,8 @@
         <w:tblLook w:val="01E0" w:firstRow="1" w:lastRow="1" w:firstColumn="1" w:lastColumn="1" w:noHBand="0" w:noVBand="0"/>
       </w:tblPr>
       <w:tblGrid>
-        <w:gridCol w:w="540"/>
-        <w:gridCol w:w="1804"/>
+        <w:gridCol w:w="805"/>
+        <w:gridCol w:w="1932"/>
         <w:gridCol w:w="228"/>
         <w:gridCol w:w="1890"/>
         <w:gridCol w:w="346"/>
@@ -1002,7 +998,7 @@
         </w:trPr>
         <w:tc>
           <w:tcPr>
-            <w:tcW w:w="2344" w:type="dxa"/>
+            <w:tcW w:w="2737" w:type="dxa"/>
             <w:gridSpan w:val="2"/>
             <w:tcBorders>
               <w:top w:val="nil"/>
@@ -1139,7 +1135,7 @@
         </w:trPr>
         <w:tc>
           <w:tcPr>
-            <w:tcW w:w="2344" w:type="dxa"/>
+            <w:tcW w:w="2737" w:type="dxa"/>
             <w:gridSpan w:val="2"/>
             <w:tcBorders>
               <w:top w:val="single" w:sz="4" w:space="0" w:color="auto"/>
@@ -1263,7 +1259,7 @@
         </w:trPr>
         <w:tc>
           <w:tcPr>
-            <w:tcW w:w="540" w:type="dxa"/>
+            <w:tcW w:w="805" w:type="dxa"/>
           </w:tcPr>
           <w:p>
             <w:pPr>
@@ -1283,7 +1279,7 @@
         </w:tc>
         <w:tc>
           <w:tcPr>
-            <w:tcW w:w="3922" w:type="dxa"/>
+            <w:tcW w:w="4050" w:type="dxa"/>
             <w:gridSpan w:val="3"/>
           </w:tcPr>
           <w:p>
@@ -1351,7 +1347,7 @@
         </w:trPr>
         <w:tc>
           <w:tcPr>
-            <w:tcW w:w="540" w:type="dxa"/>
+            <w:tcW w:w="805" w:type="dxa"/>
           </w:tcPr>
           <w:p>
             <w:pPr>
@@ -1371,7 +1367,7 @@
         </w:tc>
         <w:tc>
           <w:tcPr>
-            <w:tcW w:w="3922" w:type="dxa"/>
+            <w:tcW w:w="4050" w:type="dxa"/>
             <w:gridSpan w:val="3"/>
           </w:tcPr>
           <w:p>
@@ -1452,7 +1448,7 @@
         </w:trPr>
         <w:tc>
           <w:tcPr>
-            <w:tcW w:w="540" w:type="dxa"/>
+            <w:tcW w:w="805" w:type="dxa"/>
           </w:tcPr>
           <w:p>
             <w:pPr>
@@ -1472,7 +1468,7 @@
         </w:tc>
         <w:tc>
           <w:tcPr>
-            <w:tcW w:w="3922" w:type="dxa"/>
+            <w:tcW w:w="4050" w:type="dxa"/>
             <w:gridSpan w:val="3"/>
           </w:tcPr>
           <w:p>
@@ -1592,7 +1588,7 @@
         </w:trPr>
         <w:tc>
           <w:tcPr>
-            <w:tcW w:w="540" w:type="dxa"/>
+            <w:tcW w:w="805" w:type="dxa"/>
           </w:tcPr>
           <w:p>
             <w:pPr>
@@ -1612,7 +1608,7 @@
         </w:tc>
         <w:tc>
           <w:tcPr>
-            <w:tcW w:w="3922" w:type="dxa"/>
+            <w:tcW w:w="4050" w:type="dxa"/>
             <w:gridSpan w:val="3"/>
           </w:tcPr>
           <w:p>
@@ -1685,7 +1681,7 @@
         </w:trPr>
         <w:tc>
           <w:tcPr>
-            <w:tcW w:w="540" w:type="dxa"/>
+            <w:tcW w:w="805" w:type="dxa"/>
           </w:tcPr>
           <w:p>
             <w:pPr>
@@ -1705,7 +1701,7 @@
         </w:tc>
         <w:tc>
           <w:tcPr>
-            <w:tcW w:w="3922" w:type="dxa"/>
+            <w:tcW w:w="4050" w:type="dxa"/>
             <w:gridSpan w:val="3"/>
           </w:tcPr>
           <w:p>
@@ -1752,7 +1748,7 @@
         </w:trPr>
         <w:tc>
           <w:tcPr>
-            <w:tcW w:w="540" w:type="dxa"/>
+            <w:tcW w:w="805" w:type="dxa"/>
           </w:tcPr>
           <w:p>
             <w:pPr>
@@ -1772,7 +1768,7 @@
         </w:tc>
         <w:tc>
           <w:tcPr>
-            <w:tcW w:w="3922" w:type="dxa"/>
+            <w:tcW w:w="4050" w:type="dxa"/>
             <w:gridSpan w:val="3"/>
           </w:tcPr>
           <w:p>
@@ -1840,7 +1836,7 @@
         </w:trPr>
         <w:tc>
           <w:tcPr>
-            <w:tcW w:w="540" w:type="dxa"/>
+            <w:tcW w:w="805" w:type="dxa"/>
           </w:tcPr>
           <w:p>
             <w:pPr>
@@ -1860,7 +1856,7 @@
         </w:tc>
         <w:tc>
           <w:tcPr>
-            <w:tcW w:w="3922" w:type="dxa"/>
+            <w:tcW w:w="4050" w:type="dxa"/>
             <w:gridSpan w:val="3"/>
           </w:tcPr>
           <w:p>
@@ -1976,7 +1972,7 @@
         </w:trPr>
         <w:tc>
           <w:tcPr>
-            <w:tcW w:w="540" w:type="dxa"/>
+            <w:tcW w:w="805" w:type="dxa"/>
           </w:tcPr>
           <w:p>
             <w:pPr>
@@ -1996,7 +1992,7 @@
         </w:tc>
         <w:tc>
           <w:tcPr>
-            <w:tcW w:w="3922" w:type="dxa"/>
+            <w:tcW w:w="4050" w:type="dxa"/>
             <w:gridSpan w:val="3"/>
           </w:tcPr>
           <w:p>
@@ -2064,7 +2060,7 @@
         </w:trPr>
         <w:tc>
           <w:tcPr>
-            <w:tcW w:w="540" w:type="dxa"/>
+            <w:tcW w:w="805" w:type="dxa"/>
           </w:tcPr>
           <w:p>
             <w:pPr>
@@ -2084,7 +2080,7 @@
         </w:tc>
         <w:tc>
           <w:tcPr>
-            <w:tcW w:w="3922" w:type="dxa"/>
+            <w:tcW w:w="4050" w:type="dxa"/>
             <w:gridSpan w:val="3"/>
           </w:tcPr>
           <w:p>
@@ -2131,7 +2127,7 @@
         </w:trPr>
         <w:tc>
           <w:tcPr>
-            <w:tcW w:w="540" w:type="dxa"/>
+            <w:tcW w:w="805" w:type="dxa"/>
           </w:tcPr>
           <w:p>
             <w:pPr>
@@ -2151,7 +2147,7 @@
         </w:tc>
         <w:tc>
           <w:tcPr>
-            <w:tcW w:w="3922" w:type="dxa"/>
+            <w:tcW w:w="4050" w:type="dxa"/>
             <w:gridSpan w:val="3"/>
           </w:tcPr>
           <w:p>
@@ -2305,7 +2301,7 @@
         </w:trPr>
         <w:tc>
           <w:tcPr>
-            <w:tcW w:w="540" w:type="dxa"/>
+            <w:tcW w:w="805" w:type="dxa"/>
           </w:tcPr>
           <w:p>
             <w:pPr>
@@ -2325,7 +2321,7 @@
         </w:tc>
         <w:tc>
           <w:tcPr>
-            <w:tcW w:w="3922" w:type="dxa"/>
+            <w:tcW w:w="4050" w:type="dxa"/>
             <w:gridSpan w:val="3"/>
           </w:tcPr>
           <w:p>
@@ -2429,7 +2425,7 @@
         </w:trPr>
         <w:tc>
           <w:tcPr>
-            <w:tcW w:w="540" w:type="dxa"/>
+            <w:tcW w:w="805" w:type="dxa"/>
           </w:tcPr>
           <w:p>
             <w:pPr>
@@ -2449,7 +2445,7 @@
         </w:tc>
         <w:tc>
           <w:tcPr>
-            <w:tcW w:w="3922" w:type="dxa"/>
+            <w:tcW w:w="4050" w:type="dxa"/>
             <w:gridSpan w:val="3"/>
           </w:tcPr>
           <w:p>
@@ -2588,7 +2584,7 @@
         </w:trPr>
         <w:tc>
           <w:tcPr>
-            <w:tcW w:w="540" w:type="dxa"/>
+            <w:tcW w:w="805" w:type="dxa"/>
           </w:tcPr>
           <w:p>
             <w:pPr>
@@ -2608,7 +2604,7 @@
         </w:tc>
         <w:tc>
           <w:tcPr>
-            <w:tcW w:w="3922" w:type="dxa"/>
+            <w:tcW w:w="4050" w:type="dxa"/>
             <w:gridSpan w:val="3"/>
           </w:tcPr>
           <w:p>
@@ -2696,7 +2692,7 @@
         </w:trPr>
         <w:tc>
           <w:tcPr>
-            <w:tcW w:w="540" w:type="dxa"/>
+            <w:tcW w:w="805" w:type="dxa"/>
           </w:tcPr>
           <w:p>
             <w:pPr>
@@ -2716,7 +2712,7 @@
         </w:tc>
         <w:tc>
           <w:tcPr>
-            <w:tcW w:w="3922" w:type="dxa"/>
+            <w:tcW w:w="4050" w:type="dxa"/>
             <w:gridSpan w:val="3"/>
           </w:tcPr>
           <w:p>
@@ -2836,7 +2832,7 @@
         </w:trPr>
         <w:tc>
           <w:tcPr>
-            <w:tcW w:w="540" w:type="dxa"/>
+            <w:tcW w:w="805" w:type="dxa"/>
           </w:tcPr>
           <w:p>
             <w:pPr>
@@ -2855,7 +2851,7 @@
         </w:tc>
         <w:tc>
           <w:tcPr>
-            <w:tcW w:w="3922" w:type="dxa"/>
+            <w:tcW w:w="4050" w:type="dxa"/>
             <w:gridSpan w:val="3"/>
           </w:tcPr>
           <w:p>
@@ -2968,7 +2964,7 @@
         </w:trPr>
         <w:tc>
           <w:tcPr>
-            <w:tcW w:w="540" w:type="dxa"/>
+            <w:tcW w:w="805" w:type="dxa"/>
           </w:tcPr>
           <w:p>
             <w:pPr>
@@ -2988,7 +2984,7 @@
         </w:tc>
         <w:tc>
           <w:tcPr>
-            <w:tcW w:w="3922" w:type="dxa"/>
+            <w:tcW w:w="4050" w:type="dxa"/>
             <w:gridSpan w:val="3"/>
           </w:tcPr>
           <w:p>
@@ -3403,37 +3399,9 @@
         <w:rPr>
           <w:b w:val="0"/>
           <w:bCs w:val="0"/>
-          <w:sz w:val="22"/>
-          <w:szCs w:val="22"/>
-        </w:rPr>
-      </w:pPr>
-      <w:r>
-        <w:rPr>
-          <w:b w:val="0"/>
-          <w:bCs w:val="0"/>
-          <w:sz w:val="22"/>
-          <w:szCs w:val="22"/>
-        </w:rPr>
-        <w:t>{S</w:t>
-      </w:r>
-      <w:r>
-        <w:rPr>
-          <w:b w:val="0"/>
-          <w:bCs w:val="0"/>
-          <w:sz w:val="22"/>
-          <w:szCs w:val="22"/>
-        </w:rPr>
-        <w:t>ignature</w:t>
-      </w:r>
-      <w:r>
-        <w:rPr>
-          <w:b w:val="0"/>
-          <w:bCs w:val="0"/>
-          <w:sz w:val="22"/>
-          <w:szCs w:val="22"/>
-        </w:rPr>
-        <w:t>}</w:t>
-      </w:r>
+          <w:lang w:val="en-IN"/>
+        </w:rPr>
+      </w:pPr>
     </w:p>
     <w:p>
       <w:pPr>

</xml_diff>